<commit_message>
Ezra 2nd deep review: 3 EN restores (young bulls, anointing oil, Tattenai appellation, join them)
</commit_message>
<xml_diff>
--- a/gdocs_build/Ezra.docx
+++ b/gdocs_build/Ezra.docx
@@ -9589,7 +9589,7 @@
               <w:rPr>
                 <w:sz w:val="18"/>
               </w:rPr>
-              <w:t>Second, whatever they need for their worship services—bulls, rams, lambs for offerings to the God of Heaven, plus wheat, salt, wine, and oil for the priests in Jerusalem—you give it to them. Every single day, no excuses. This is so they can make their sacrifices and pray for me and my sons.</w:t>
+              <w:t>Second, whatever they need for their worship services—young bulls, rams, and lambs for offerings to the God of Heaven, plus wheat, salt, wine, and anointing oil for the priests in Jerusalem—you give it to them. Every single day, no excuses. This is so they can make their sacrifices and pray for me and my sons.</w:t>
             </w:r>
           </w:p>
         </w:tc>
@@ -9612,7 +9612,7 @@
               <w:rPr>
                 <w:sz w:val="18"/>
               </w:rPr>
-              <w:t>둘째, 제사에 필요한 거, 예를 들어 하늘의 하나님께 번제로 드릴 소, 양, 어린 양, 그리고 예루살렘 제사장들이 달라고 하는 밀, 소금, 포도주, 기름 같은 거 매일매일 빠짐없이 줘. 그래야 그 사람들이 하나님께 제사 드리면서 왕이랑 왕자들 위해서 기도해주지.</w:t>
+              <w:t>둘째, 제사에 필요한 거, 예를 들어 하늘의 하나님께 번제로 드릴 어린 수소, 숫양, 어린 양, 그리고 예루살렘 제사장들이 달라고 하는 밀, 소금, 포도주, 관유 같은 거 매일매일 빠짐없이 줘. 그래야 그 사람들이 하나님께 제사 드리면서 왕이랑 왕자들 위해서 기도해주지.</w:t>
             </w:r>
           </w:p>
         </w:tc>
@@ -9810,7 +9810,7 @@
               <w:rPr>
                 <w:sz w:val="18"/>
               </w:rPr>
-              <w:t>And you know what? Tattenai, the governor, Shethar-Bozenai, and his buddies did exactly that. They followed Darius's orders perfectly and right away.</w:t>
+              <w:t>And you know what? Tattenai, the governor of the land across the Euphrates, Shethar-Bozenai, and his buddies did exactly that. They followed Darius's orders perfectly and right away.</w:t>
             </w:r>
           </w:p>
         </w:tc>
@@ -10165,7 +10165,7 @@
               <w:rPr>
                 <w:sz w:val="18"/>
               </w:rPr>
-              <w:t>Then all the Israelites who were back from exile, plus anyone else who had left their old ways to follow the God of Israel, ate the Passover meal together. They were so happy, they celebrated the Feast of Unleavened Bread for seven whole days. God had totally filled them with joy and even changed the mind of the king of Assyria to support them in rebuilding the Temple of their God, the God of Israel. Wild, right?</w:t>
+              <w:t>Then all the Israelites who were back from exile, plus anyone else who had left their old ways to join them and follow the God of Israel, ate the Passover meal together. They were so happy, they celebrated the Feast of Unleavened Bread for seven whole days. God had totally filled them with joy and even changed the mind of the king of Assyria to support them in rebuilding the Temple of their God, the God of Israel. Wild, right?</w:t>
             </w:r>
           </w:p>
         </w:tc>

</xml_diff>

<commit_message>
Ezra 'Temple of God' 3건 복원 (6:7, 10:6, 10:9 — 느헤미야와 동일 패턴, 성욱 승인) — EN/KO 1:1, GDocs 10/10 export-back verified
</commit_message>
<xml_diff>
--- a/gdocs_build/Ezra.docx
+++ b/gdocs_build/Ezra.docx
@@ -9360,7 +9360,7 @@
               <w:rPr>
                 <w:sz w:val="18"/>
               </w:rPr>
-              <w:t>Then Darius added his own two cents. He was like, "Listen up, Tattenai, you're the governor of the whole area across the Euphrates—you, Shethar-Bozenai, and your crew need to back off. Just stay out of their way. Let the governor and the Jewish leaders do their thing and rebuild the Temple.</w:t>
+              <w:t>Then Darius added his own two cents. He was like, "Listen up, Tattenai, you're the governor of the whole area across the Euphrates—you, Shethar-Bozenai, and your crew need to back off. Just stay out of their way. Let the governor and the Jewish leaders do their thing and rebuild the Temple of God.</w:t>
             </w:r>
           </w:p>
         </w:tc>
@@ -9383,7 +9383,7 @@
               <w:rPr>
                 <w:sz w:val="18"/>
               </w:rPr>
-              <w:t>그리고 다리우스 왕이 또 이렇게 명령을 내렸대. "야, 유프라테스 강 건너편 총독 다드래랑 스달보스내, 그리고 너네 관리들 잘 들어. 거기서 당장 나와. 유다 총독이랑 지도자들이 성전 재건하는 거 방해하지 말고 냅두라고.</w:t>
+              <w:t>그리고 다리우스 왕이 또 이렇게 명령을 내렸대. "야, 유프라테스 강 건너편 총독 다드래랑 스달보스내, 그리고 너네 관리들 잘 들어. 거기서 당장 나와. 유다 총독이랑 지도자들이 하나님의 성전 재건하는 거 방해하지 말고 냅두라고.</w:t>
             </w:r>
           </w:p>
         </w:tc>
@@ -13339,7 +13339,7 @@
               <w:rPr>
                 <w:sz w:val="18"/>
               </w:rPr>
-              <w:t>After that, Ezra bounced from the Temple square and crashed at Jehohanan son of Eliashib's place. He was still on a hunger strike, not eating or drinking anything, just mourning hard over how the exiles had been so unfaithful.</w:t>
+              <w:t>After that, Ezra bounced from the square in front of the Temple of God and crashed at Jehohanan son of Eliashib's place. He was still on a hunger strike, not eating or drinking anything, just mourning hard over how the exiles had been so unfaithful.</w:t>
             </w:r>
           </w:p>
         </w:tc>
@@ -13362,7 +13362,7 @@
               <w:rPr>
                 <w:sz w:val="18"/>
               </w:rPr>
-              <w:t>그러고 나서 에스라는 성전 앞 광장을 떠나서 엘리아십의 아들 여호하난의 집으로 갔대. 거기서도 밥도 안 먹고 물도 안 마시면서, 포로로 잡혀갔다 돌아온 사람들이 저지른 배신 때문에 계속 슬퍼했대.</w:t>
+              <w:t>그러고 나서 에스라는 하나님의 성전 앞 광장을 떠나서 엘리아십의 아들 여호하난의 집으로 갔대. 거기서도 밥도 안 먹고 물도 안 마시면서, 포로로 잡혀갔다 돌아온 사람들이 저지른 배신 때문에 계속 슬퍼했대.</w:t>
             </w:r>
           </w:p>
         </w:tc>
@@ -13481,7 +13481,7 @@
               <w:rPr>
                 <w:sz w:val="18"/>
               </w:rPr>
-              <w:t>And yo, everyone from Judah and Benjamin actually showed up in Jerusalem within the three days. It was the twentieth day of the ninth month, and they were all just sitting in the square in front of the Temple. They were all super antsy, partly because of the serious stuff they had to deal with, and partly 'cause it was pouring rain.</w:t>
+              <w:t>And yo, everyone from Judah and Benjamin actually showed up in Jerusalem within the three days. It was the twentieth day of the ninth month, and they were all just sitting in the square in front of the Temple of God. They were all super antsy, partly because of the serious stuff they had to deal with, and partly 'cause it was pouring rain.</w:t>
             </w:r>
           </w:p>
         </w:tc>
@@ -13504,7 +13504,7 @@
               <w:rPr>
                 <w:sz w:val="18"/>
               </w:rPr>
-              <w:t>유다랑 베냐민 사람들이 진짜 3일 안에 다 예루살렘으로 모였대. 그날이 아홉째 달 20일이었는데, 다들 성전 앞 광장에 앉아 있었음. 처리해야 할 문제도 심각한데 비까지 쏟아지니까, 다들 불안하고 초조해서 어쩔 줄 몰라 했대.</w:t>
+              <w:t>유다랑 베냐민 사람들이 진짜 3일 안에 다 예루살렘으로 모였대. 그날이 아홉째 달 20일이었는데, 다들 하나님의 성전 앞 광장에 앉아 있었음. 처리해야 할 문제도 심각한데 비까지 쏟아지니까, 다들 불안하고 초조해서 어쩔 줄 몰라 했대.</w:t>
             </w:r>
           </w:p>
         </w:tc>

</xml_diff>